<commit_message>
Fix corrupted workbook XML, authorship tells, and oracle deliverables
Co-authored-by: Cursor <cursoragent@cursor.com>
</commit_message>
<xml_diff>
--- a/regional_IT_notes.docx
+++ b/regional_IT_notes.docx
@@ -20,11 +20,7 @@
         <w:jc w:val="center"/>
       </w:pPr>
       <w:r>
-        <w:rPr>
-          <w:i/>
-          <w:sz w:val="18"/>
-        </w:rPr>
-        <w:t>Meridian Data Services | Working notes collected 2026-07-01 through 2026-08-05</w:t>
+        <w:t>Yanou &amp; Partners IT Services | Working notes collected 2026-07-01 through 2026-08-05</w:t>
       </w:r>
     </w:p>
     <w:p>

</xml_diff>